<commit_message>
Drop unimplemented MCP option C; add walkthrough video sources
- Architecture diagram and docs: MCP servers are hosted on AgentCore Runtime
  or Lambda only; remove the ECS + private connection (VPC Lattice) option.
- Add docs/video (slides.py, build_video.py) that builds the solution
  walkthrough video with playwright-cli, Amazon Polly and ffmpeg.
- README: list docs/video in the tree and document the video build.
</commit_message>
<xml_diff>
--- a/docs/01-方案说明.docx
+++ b/docs/01-方案说明.docx
@@ -452,7 +452,7 @@
           <w:b w:val="0"/>
           <w:sz w:val="21"/>
         </w:rPr>
-        <w:t>：现有的 Elasticsearch、Prometheus、Nexus MCP Server 满足协议与认证要求后即可注册接入；托管方式可按安全基线在 AgentCore Runtime、Lambda、ECS + 私有连接三种之间选择（4.4.3）。</w:t>
+        <w:t>：现有的 Elasticsearch、Prometheus、Nexus MCP Server 满足协议与认证要求后即可注册接入；托管方式可在 AgentCore Runtime 与 Lambda 两种之间选择，Demo 中均已实现（4.4.3）。</w:t>
       </w:r>
     </w:p>
     <w:p>
@@ -2925,7 +2925,7 @@
                 <w:b w:val="0"/>
                 <w:sz w:val="18"/>
               </w:rPr>
-              <w:t>Amazon Bedrock AgentCore Runtime、AWS Lambda，或 Amazon ECS + 私有连接</w:t>
+              <w:t>Amazon Bedrock AgentCore Runtime 或 AWS Lambda</w:t>
             </w:r>
           </w:p>
         </w:tc>
@@ -4172,7 +4172,7 @@
                 <w:b w:val="0"/>
                 <w:sz w:val="18"/>
               </w:rPr>
-              <w:t>HTTPS；位于私有网络时通过私有连接（基于 Amazon VPC Lattice）访问</w:t>
+              <w:t>HTTPS 端点</w:t>
             </w:r>
           </w:p>
         </w:tc>
@@ -4317,7 +4317,7 @@
           <w:b w:val="0"/>
           <w:sz w:val="21"/>
         </w:rPr>
-        <w:t>托管方式按企业的安全基线选择：</w:t>
+        <w:t>托管方式有以下两种，Demo 中各实现了一个：</w:t>
       </w:r>
     </w:p>
     <w:tbl>
@@ -4329,10 +4329,10 @@
         <w:tblLook w:firstColumn="1" w:firstRow="1" w:lastColumn="0" w:lastRow="0" w:noHBand="0" w:noVBand="1" w:val="04A0"/>
       </w:tblPr>
       <w:tblGrid>
-        <w:gridCol w:w="2056"/>
-        <w:gridCol w:w="2956"/>
+        <w:gridCol w:w="1905"/>
+        <w:gridCol w:w="3033"/>
         <w:gridCol w:w="1882"/>
-        <w:gridCol w:w="2856"/>
+        <w:gridCol w:w="2931"/>
       </w:tblGrid>
       <w:tr>
         <w:trPr>
@@ -4341,7 +4341,7 @@
         </w:trPr>
         <w:tc>
           <w:tcPr>
-            <w:tcW w:type="dxa" w:w="2056"/>
+            <w:tcW w:type="dxa" w:w="1905"/>
             <w:shd w:val="clear" w:color="auto" w:fill="D9E2F3"/>
           </w:tcPr>
           <w:p>
@@ -4361,7 +4361,7 @@
         </w:tc>
         <w:tc>
           <w:tcPr>
-            <w:tcW w:type="dxa" w:w="2956"/>
+            <w:tcW w:type="dxa" w:w="3033"/>
             <w:shd w:val="clear" w:color="auto" w:fill="D9E2F3"/>
           </w:tcPr>
           <w:p>
@@ -4401,7 +4401,7 @@
         </w:tc>
         <w:tc>
           <w:tcPr>
-            <w:tcW w:type="dxa" w:w="2856"/>
+            <w:tcW w:type="dxa" w:w="2931"/>
             <w:shd w:val="clear" w:color="auto" w:fill="D9E2F3"/>
           </w:tcPr>
           <w:p>
@@ -4426,7 +4426,7 @@
         </w:trPr>
         <w:tc>
           <w:tcPr>
-            <w:tcW w:type="dxa" w:w="2056"/>
+            <w:tcW w:type="dxa" w:w="1905"/>
           </w:tcPr>
           <w:p>
             <w:pPr>
@@ -4444,7 +4444,7 @@
         </w:tc>
         <w:tc>
           <w:tcPr>
-            <w:tcW w:type="dxa" w:w="2956"/>
+            <w:tcW w:type="dxa" w:w="3033"/>
           </w:tcPr>
           <w:p>
             <w:pPr>
@@ -4480,7 +4480,7 @@
         </w:tc>
         <w:tc>
           <w:tcPr>
-            <w:tcW w:type="dxa" w:w="2856"/>
+            <w:tcW w:type="dxa" w:w="2931"/>
           </w:tcPr>
           <w:p>
             <w:pPr>
@@ -4503,7 +4503,7 @@
         </w:trPr>
         <w:tc>
           <w:tcPr>
-            <w:tcW w:type="dxa" w:w="2056"/>
+            <w:tcW w:type="dxa" w:w="1905"/>
           </w:tcPr>
           <w:p>
             <w:pPr>
@@ -4521,7 +4521,7 @@
         </w:tc>
         <w:tc>
           <w:tcPr>
-            <w:tcW w:type="dxa" w:w="2956"/>
+            <w:tcW w:type="dxa" w:w="3033"/>
           </w:tcPr>
           <w:p>
             <w:pPr>
@@ -4573,7 +4573,7 @@
         </w:tc>
         <w:tc>
           <w:tcPr>
-            <w:tcW w:type="dxa" w:w="2856"/>
+            <w:tcW w:type="dxa" w:w="2931"/>
           </w:tcPr>
           <w:p>
             <w:pPr>
@@ -4586,83 +4586,6 @@
                 <w:sz w:val="18"/>
               </w:rPr>
               <w:t>新写的轻量只读工具（如 Nexus 查询），成本最低</w:t>
-            </w:r>
-          </w:p>
-        </w:tc>
-      </w:tr>
-      <w:tr>
-        <w:trPr>
-          <w:cantSplit w:val="true"/>
-        </w:trPr>
-        <w:tc>
-          <w:tcPr>
-            <w:tcW w:type="dxa" w:w="2056"/>
-          </w:tcPr>
-          <w:p>
-            <w:pPr>
-              <w:spacing w:after="0"/>
-            </w:pPr>
-            <w:r>
-              <w:rPr>
-                <w:rFonts w:ascii="宋体" w:hAnsi="宋体" w:eastAsia="宋体"/>
-                <w:b w:val="0"/>
-                <w:sz w:val="18"/>
-              </w:rPr>
-              <w:t>C. Amazon ECS + 私有连接（VPC Lattice）</w:t>
-            </w:r>
-          </w:p>
-        </w:tc>
-        <w:tc>
-          <w:tcPr>
-            <w:tcW w:type="dxa" w:w="2956"/>
-          </w:tcPr>
-          <w:p>
-            <w:pPr>
-              <w:spacing w:after="0"/>
-            </w:pPr>
-            <w:r>
-              <w:rPr>
-                <w:rFonts w:ascii="宋体" w:hAnsi="宋体" w:eastAsia="宋体"/>
-                <w:b w:val="0"/>
-                <w:sz w:val="18"/>
-              </w:rPr>
-              <w:t>任一支持的方式</w:t>
-            </w:r>
-          </w:p>
-        </w:tc>
-        <w:tc>
-          <w:tcPr>
-            <w:tcW w:type="dxa" w:w="1882"/>
-          </w:tcPr>
-          <w:p>
-            <w:pPr>
-              <w:spacing w:after="0"/>
-            </w:pPr>
-            <w:r>
-              <w:rPr>
-                <w:rFonts w:ascii="宋体" w:hAnsi="宋体" w:eastAsia="宋体"/>
-                <w:b w:val="0"/>
-                <w:sz w:val="18"/>
-              </w:rPr>
-              <w:t>无公网端点</w:t>
-            </w:r>
-          </w:p>
-        </w:tc>
-        <w:tc>
-          <w:tcPr>
-            <w:tcW w:type="dxa" w:w="2856"/>
-          </w:tcPr>
-          <w:p>
-            <w:pPr>
-              <w:spacing w:after="0"/>
-            </w:pPr>
-            <w:r>
-              <w:rPr>
-                <w:rFonts w:ascii="宋体" w:hAnsi="宋体" w:eastAsia="宋体"/>
-                <w:b w:val="0"/>
-                <w:sz w:val="18"/>
-              </w:rPr>
-              <w:t>安全基线要求“不得有公网可达端点”</w:t>
             </w:r>
           </w:p>
         </w:tc>
@@ -4684,7 +4607,7 @@
           <w:b w:val="0"/>
           <w:sz w:val="21"/>
         </w:rPr>
-        <w:t>• 方式 A、B 的端点在网络上公网可达，但只接受通过认证的请求：未签名或令牌无效的请求在服务入口即被拒绝，不会执行 MCP 代码。Demo 中已实测未签名请求返回 HTTP 403。</w:t>
+        <w:t>• 两种方式的端点在网络上公网可达，但只接受通过认证的请求：未签名或令牌无效的请求在服务入口即被拒绝，不会执行 MCP 代码。Demo 中已实测未签名请求返回 HTTP 403。</w:t>
       </w:r>
     </w:p>
     <w:p>
@@ -4698,7 +4621,7 @@
           <w:b w:val="0"/>
           <w:sz w:val="21"/>
         </w:rPr>
-        <w:t>• 方式 A、B 在 AWS 官方博客中均有与 DevOps Agent 对接的示例：</w:t>
+        <w:t>• 两种方式在 AWS 官方博客中均有与 DevOps Agent 对接的示例：</w:t>
       </w:r>
       <w:hyperlink r:id="rId14">
         <w:r>
@@ -8754,7 +8677,7 @@
                 <w:b w:val="0"/>
                 <w:sz w:val="18"/>
               </w:rPr>
-              <w:t>确认是否允许“公网可达但必须认证”的 MCP 端点，以确定托管方式（4.4.3 的 A / B 或 C）</w:t>
+              <w:t>确认允许“公网可达但必须认证”的 MCP 端点（4.4.3 的两种托管方式均为此类）</w:t>
             </w:r>
           </w:p>
         </w:tc>
@@ -8790,7 +8713,7 @@
                 <w:b w:val="0"/>
                 <w:sz w:val="18"/>
               </w:rPr>
-              <w:t>MCP 托管方式无法确定</w:t>
+              <w:t>MCP 无法按本方案托管，需另行评估</w:t>
             </w:r>
           </w:p>
         </w:tc>
@@ -11275,9 +11198,9 @@
         <w:tblLook w:firstColumn="1" w:firstRow="1" w:lastColumn="0" w:lastRow="0" w:noHBand="0" w:noVBand="1" w:val="04A0"/>
       </w:tblPr>
       <w:tblGrid>
-        <w:gridCol w:w="2810"/>
-        <w:gridCol w:w="1798"/>
-        <w:gridCol w:w="5143"/>
+        <w:gridCol w:w="2669"/>
+        <w:gridCol w:w="1708"/>
+        <w:gridCol w:w="5374"/>
       </w:tblGrid>
       <w:tr>
         <w:trPr>
@@ -11286,7 +11209,7 @@
         </w:trPr>
         <w:tc>
           <w:tcPr>
-            <w:tcW w:type="dxa" w:w="2810"/>
+            <w:tcW w:type="dxa" w:w="2669"/>
             <w:shd w:val="clear" w:color="auto" w:fill="D9E2F3"/>
           </w:tcPr>
           <w:p>
@@ -11306,7 +11229,7 @@
         </w:tc>
         <w:tc>
           <w:tcPr>
-            <w:tcW w:type="dxa" w:w="1798"/>
+            <w:tcW w:type="dxa" w:w="1708"/>
             <w:shd w:val="clear" w:color="auto" w:fill="D9E2F3"/>
           </w:tcPr>
           <w:p>
@@ -11326,7 +11249,7 @@
         </w:tc>
         <w:tc>
           <w:tcPr>
-            <w:tcW w:type="dxa" w:w="5143"/>
+            <w:tcW w:type="dxa" w:w="5374"/>
             <w:shd w:val="clear" w:color="auto" w:fill="D9E2F3"/>
           </w:tcPr>
           <w:p>
@@ -11351,7 +11274,7 @@
         </w:trPr>
         <w:tc>
           <w:tcPr>
-            <w:tcW w:type="dxa" w:w="2810"/>
+            <w:tcW w:type="dxa" w:w="2669"/>
           </w:tcPr>
           <w:p>
             <w:pPr>
@@ -11369,7 +11292,7 @@
         </w:tc>
         <w:tc>
           <w:tcPr>
-            <w:tcW w:type="dxa" w:w="1798"/>
+            <w:tcW w:type="dxa" w:w="1708"/>
           </w:tcPr>
           <w:p>
             <w:pPr>
@@ -11387,7 +11310,7 @@
         </w:tc>
         <w:tc>
           <w:tcPr>
-            <w:tcW w:type="dxa" w:w="5143"/>
+            <w:tcW w:type="dxa" w:w="5374"/>
           </w:tcPr>
           <w:p>
             <w:pPr>
@@ -11410,7 +11333,7 @@
         </w:trPr>
         <w:tc>
           <w:tcPr>
-            <w:tcW w:type="dxa" w:w="2810"/>
+            <w:tcW w:type="dxa" w:w="2669"/>
           </w:tcPr>
           <w:p>
             <w:pPr>
@@ -11428,7 +11351,7 @@
         </w:tc>
         <w:tc>
           <w:tcPr>
-            <w:tcW w:type="dxa" w:w="1798"/>
+            <w:tcW w:type="dxa" w:w="1708"/>
           </w:tcPr>
           <w:p>
             <w:pPr>
@@ -11446,7 +11369,7 @@
         </w:tc>
         <w:tc>
           <w:tcPr>
-            <w:tcW w:type="dxa" w:w="5143"/>
+            <w:tcW w:type="dxa" w:w="5374"/>
           </w:tcPr>
           <w:p>
             <w:pPr>
@@ -11469,7 +11392,7 @@
         </w:trPr>
         <w:tc>
           <w:tcPr>
-            <w:tcW w:type="dxa" w:w="2810"/>
+            <w:tcW w:type="dxa" w:w="2669"/>
           </w:tcPr>
           <w:p>
             <w:pPr>
@@ -11487,7 +11410,7 @@
         </w:tc>
         <w:tc>
           <w:tcPr>
-            <w:tcW w:type="dxa" w:w="1798"/>
+            <w:tcW w:type="dxa" w:w="1708"/>
           </w:tcPr>
           <w:p>
             <w:pPr>
@@ -11505,7 +11428,7 @@
         </w:tc>
         <w:tc>
           <w:tcPr>
-            <w:tcW w:type="dxa" w:w="5143"/>
+            <w:tcW w:type="dxa" w:w="5374"/>
           </w:tcPr>
           <w:p>
             <w:pPr>
@@ -11544,7 +11467,7 @@
         </w:trPr>
         <w:tc>
           <w:tcPr>
-            <w:tcW w:type="dxa" w:w="2810"/>
+            <w:tcW w:type="dxa" w:w="2669"/>
           </w:tcPr>
           <w:p>
             <w:pPr>
@@ -11562,7 +11485,7 @@
         </w:tc>
         <w:tc>
           <w:tcPr>
-            <w:tcW w:type="dxa" w:w="1798"/>
+            <w:tcW w:type="dxa" w:w="1708"/>
           </w:tcPr>
           <w:p>
             <w:pPr>
@@ -11580,7 +11503,7 @@
         </w:tc>
         <w:tc>
           <w:tcPr>
-            <w:tcW w:type="dxa" w:w="5143"/>
+            <w:tcW w:type="dxa" w:w="5374"/>
           </w:tcPr>
           <w:p>
             <w:pPr>
@@ -11603,7 +11526,7 @@
         </w:trPr>
         <w:tc>
           <w:tcPr>
-            <w:tcW w:type="dxa" w:w="2810"/>
+            <w:tcW w:type="dxa" w:w="2669"/>
           </w:tcPr>
           <w:p>
             <w:pPr>
@@ -11621,7 +11544,7 @@
         </w:tc>
         <w:tc>
           <w:tcPr>
-            <w:tcW w:type="dxa" w:w="1798"/>
+            <w:tcW w:type="dxa" w:w="1708"/>
           </w:tcPr>
           <w:p>
             <w:pPr>
@@ -11639,7 +11562,7 @@
         </w:tc>
         <w:tc>
           <w:tcPr>
-            <w:tcW w:type="dxa" w:w="5143"/>
+            <w:tcW w:type="dxa" w:w="5374"/>
           </w:tcPr>
           <w:p>
             <w:pPr>
@@ -11662,7 +11585,7 @@
         </w:trPr>
         <w:tc>
           <w:tcPr>
-            <w:tcW w:type="dxa" w:w="2810"/>
+            <w:tcW w:type="dxa" w:w="2669"/>
           </w:tcPr>
           <w:p>
             <w:pPr>
@@ -11680,7 +11603,7 @@
         </w:tc>
         <w:tc>
           <w:tcPr>
-            <w:tcW w:type="dxa" w:w="1798"/>
+            <w:tcW w:type="dxa" w:w="1708"/>
           </w:tcPr>
           <w:p>
             <w:pPr>
@@ -11698,7 +11621,7 @@
         </w:tc>
         <w:tc>
           <w:tcPr>
-            <w:tcW w:type="dxa" w:w="5143"/>
+            <w:tcW w:type="dxa" w:w="5374"/>
           </w:tcPr>
           <w:p>
             <w:pPr>
@@ -11721,7 +11644,7 @@
         </w:trPr>
         <w:tc>
           <w:tcPr>
-            <w:tcW w:type="dxa" w:w="2810"/>
+            <w:tcW w:type="dxa" w:w="2669"/>
           </w:tcPr>
           <w:p>
             <w:pPr>
@@ -11739,7 +11662,7 @@
         </w:tc>
         <w:tc>
           <w:tcPr>
-            <w:tcW w:type="dxa" w:w="1798"/>
+            <w:tcW w:type="dxa" w:w="1708"/>
           </w:tcPr>
           <w:p>
             <w:pPr>
@@ -11757,7 +11680,7 @@
         </w:tc>
         <w:tc>
           <w:tcPr>
-            <w:tcW w:type="dxa" w:w="5143"/>
+            <w:tcW w:type="dxa" w:w="5374"/>
           </w:tcPr>
           <w:p>
             <w:pPr>
@@ -11769,7 +11692,7 @@
                 <w:b w:val="0"/>
                 <w:sz w:val="18"/>
               </w:rPr>
-              <w:t>飞书走长连接；MCP 选择私有连接方式（4.4.3 方式 C）</w:t>
+              <w:t>飞书走长连接；MCP 端点均需认证，未认证请求在入口即被拒绝（4.4.3），上线前与安全团队确认</w:t>
             </w:r>
           </w:p>
         </w:tc>
@@ -11780,7 +11703,7 @@
         </w:trPr>
         <w:tc>
           <w:tcPr>
-            <w:tcW w:type="dxa" w:w="2810"/>
+            <w:tcW w:type="dxa" w:w="2669"/>
           </w:tcPr>
           <w:p>
             <w:pPr>
@@ -11798,7 +11721,7 @@
         </w:tc>
         <w:tc>
           <w:tcPr>
-            <w:tcW w:type="dxa" w:w="1798"/>
+            <w:tcW w:type="dxa" w:w="1708"/>
           </w:tcPr>
           <w:p>
             <w:pPr>
@@ -11816,7 +11739,7 @@
         </w:tc>
         <w:tc>
           <w:tcPr>
-            <w:tcW w:type="dxa" w:w="5143"/>
+            <w:tcW w:type="dxa" w:w="5374"/>
           </w:tcPr>
           <w:p>
             <w:pPr>
@@ -12220,31 +12143,6 @@
         </w:rPr>
         <w:t xml:space="preserve">• </w:t>
       </w:r>
-      <w:hyperlink r:id="rId28">
-        <w:r>
-          <w:rPr>
-            <w:rFonts w:ascii="宋体" w:hAnsi="宋体" w:eastAsia="宋体"/>
-            <w:color w:val="0563C1"/>
-            <w:sz w:val="21"/>
-            <w:u w:val="single"/>
-          </w:rPr>
-          <w:t xml:space="preserve">连接私有网络中的工具</w:t>
-        </w:r>
-      </w:hyperlink>
-    </w:p>
-    <w:p>
-      <w:pPr>
-        <w:spacing w:after="60"/>
-        <w:ind w:left="397" w:hanging="283"/>
-      </w:pPr>
-      <w:r>
-        <w:rPr>
-          <w:rFonts w:ascii="宋体" w:hAnsi="宋体" w:eastAsia="宋体"/>
-          <w:b w:val="0"/>
-          <w:sz w:val="21"/>
-        </w:rPr>
-        <w:t xml:space="preserve">• </w:t>
-      </w:r>
       <w:hyperlink r:id="rId16">
         <w:r>
           <w:rPr>
@@ -12270,7 +12168,7 @@
         </w:rPr>
         <w:t xml:space="preserve">• </w:t>
       </w:r>
-      <w:hyperlink r:id="rId29">
+      <w:hyperlink r:id="rId28">
         <w:r>
           <w:rPr>
             <w:rFonts w:ascii="宋体" w:hAnsi="宋体" w:eastAsia="宋体"/>
@@ -12295,7 +12193,7 @@
         </w:rPr>
         <w:t xml:space="preserve">• </w:t>
       </w:r>
-      <w:hyperlink r:id="rId30">
+      <w:hyperlink r:id="rId29">
         <w:r>
           <w:rPr>
             <w:rFonts w:ascii="宋体" w:hAnsi="宋体" w:eastAsia="宋体"/>
@@ -12320,7 +12218,7 @@
         </w:rPr>
         <w:t xml:space="preserve">• </w:t>
       </w:r>
-      <w:hyperlink r:id="rId31">
+      <w:hyperlink r:id="rId30">
         <w:r>
           <w:rPr>
             <w:rFonts w:ascii="宋体" w:hAnsi="宋体" w:eastAsia="宋体"/>
@@ -12345,7 +12243,7 @@
         </w:rPr>
         <w:t xml:space="preserve">• </w:t>
       </w:r>
-      <w:hyperlink r:id="rId32">
+      <w:hyperlink r:id="rId31">
         <w:r>
           <w:rPr>
             <w:rFonts w:ascii="宋体" w:hAnsi="宋体" w:eastAsia="宋体"/>
@@ -12370,7 +12268,7 @@
         </w:rPr>
         <w:t xml:space="preserve">• </w:t>
       </w:r>
-      <w:hyperlink r:id="rId33">
+      <w:hyperlink r:id="rId32">
         <w:r>
           <w:rPr>
             <w:rFonts w:ascii="宋体" w:hAnsi="宋体" w:eastAsia="宋体"/>
@@ -12395,7 +12293,7 @@
         </w:rPr>
         <w:t xml:space="preserve">• </w:t>
       </w:r>
-      <w:hyperlink r:id="rId34">
+      <w:hyperlink r:id="rId33">
         <w:r>
           <w:rPr>
             <w:rFonts w:ascii="宋体" w:hAnsi="宋体" w:eastAsia="宋体"/>
@@ -12420,7 +12318,7 @@
         </w:rPr>
         <w:t xml:space="preserve">• </w:t>
       </w:r>
-      <w:hyperlink r:id="rId35">
+      <w:hyperlink r:id="rId34">
         <w:r>
           <w:rPr>
             <w:rFonts w:ascii="宋体" w:hAnsi="宋体" w:eastAsia="宋体"/>
@@ -12445,7 +12343,7 @@
         </w:rPr>
         <w:t xml:space="preserve">• </w:t>
       </w:r>
-      <w:hyperlink r:id="rId36">
+      <w:hyperlink r:id="rId35">
         <w:r>
           <w:rPr>
             <w:rFonts w:ascii="宋体" w:hAnsi="宋体" w:eastAsia="宋体"/>
@@ -12470,7 +12368,7 @@
         </w:rPr>
         <w:t xml:space="preserve">• </w:t>
       </w:r>
-      <w:hyperlink r:id="rId37">
+      <w:hyperlink r:id="rId36">
         <w:r>
           <w:rPr>
             <w:rFonts w:ascii="宋体" w:hAnsi="宋体" w:eastAsia="宋体"/>
@@ -12495,7 +12393,7 @@
         </w:rPr>
         <w:t xml:space="preserve">• </w:t>
       </w:r>
-      <w:hyperlink r:id="rId38">
+      <w:hyperlink r:id="rId37">
         <w:r>
           <w:rPr>
             <w:rFonts w:ascii="宋体" w:hAnsi="宋体" w:eastAsia="宋体"/>
@@ -12520,7 +12418,7 @@
         </w:rPr>
         <w:t xml:space="preserve">• </w:t>
       </w:r>
-      <w:hyperlink r:id="rId39">
+      <w:hyperlink r:id="rId38">
         <w:r>
           <w:rPr>
             <w:rFonts w:ascii="宋体" w:hAnsi="宋体" w:eastAsia="宋体"/>
@@ -12545,7 +12443,7 @@
         </w:rPr>
         <w:t xml:space="preserve">• </w:t>
       </w:r>
-      <w:hyperlink r:id="rId40">
+      <w:hyperlink r:id="rId39">
         <w:r>
           <w:rPr>
             <w:rFonts w:ascii="宋体" w:hAnsi="宋体" w:eastAsia="宋体"/>
@@ -12595,7 +12493,7 @@
         </w:rPr>
         <w:t xml:space="preserve">• </w:t>
       </w:r>
-      <w:hyperlink r:id="rId41">
+      <w:hyperlink r:id="rId40">
         <w:r>
           <w:rPr>
             <w:rFonts w:ascii="宋体" w:hAnsi="宋体" w:eastAsia="宋体"/>
@@ -12620,7 +12518,7 @@
         </w:rPr>
         <w:t xml:space="preserve">• </w:t>
       </w:r>
-      <w:hyperlink r:id="rId42">
+      <w:hyperlink r:id="rId41">
         <w:r>
           <w:rPr>
             <w:rFonts w:ascii="宋体" w:hAnsi="宋体" w:eastAsia="宋体"/>

</xml_diff>